<commit_message>
Rick e Renner: revisão da Parte 4
Co-Authored-By: Claude Opus 5.5 <noreply@anthropic.com>
Claude-Session: https://claude.ai/code/session_01MJjUEEZrxQDEUifKK2vj9g
</commit_message>
<xml_diff>
--- a/roteiros/rick-e-renner/RickRenner_Parte4.docx
+++ b/roteiros/rick-e-renner/RickRenner_Parte4.docx
@@ -31,7 +31,7 @@
         <w:rPr>
           <w:color w:val="000000"/>
         </w:rPr>
-        <w:t>Gravaram um disco novo, chamado "Inacreditável Poder do Amor". Saíram em turnê comemorativa. Os fãs lotaram os shows para ver a dupla de novo no mesmo palco.</w:t>
+        <w:t>Gravaram um disco novo, chamado "Inacreditável Poder do Amor". Saíram em turnê comemorativa, de novo no mesmo palco.</w:t>
       </w:r>
     </w:p>
     <w:p>
@@ -45,17 +45,9 @@
     <w:p>
       <w:r>
         <w:rPr>
-          <w:color w:val="000000"/>
-        </w:rPr>
-        <w:t>Mais tarde, ele mesmo ia explicar por quê. Disse que tinha acreditado na mudança do ser humano.</w:t>
-      </w:r>
-    </w:p>
-    <w:p>
-      <w:r>
-        <w:rPr>
           <w:color w:val="C00000"/>
         </w:rPr>
-        <w:t>Guarde essa frase. Acreditei na mudança do ser humano. Porque, pouco mais de dois anos depois, ela ia aparecer de novo, num texto escrito por Rick no dia mais difícil da carreira dele.</w:t>
+        <w:t>Guarde essa decisão. Porque, pouco mais de dois anos depois, Rick ia contar ao país o que realmente pensava dela. Num texto escrito no dia mais difícil da carreira dele.</w:t>
       </w:r>
     </w:p>
     <w:p>
@@ -151,7 +143,7 @@
         <w:rPr>
           <w:color w:val="000000"/>
         </w:rPr>
-        <w:t>Esse é o quarto objeto dessa história. Um vídeo de poucos segundos, com um dos cantores mais famosos do país sem conseguir ficar de pé direito, numa avenida de São Paulo.</w:t>
+        <w:t>Esse é o quarto objeto dessa história. Um vídeo de poucos segundos, com um dos cantores mais famosos do país cambaleando numa avenida de São Paulo.</w:t>
       </w:r>
     </w:p>
     <w:p>
@@ -175,7 +167,7 @@
         <w:rPr>
           <w:color w:val="000000"/>
         </w:rPr>
-        <w:t>Na delegacia, deu uma explicação para o que tinha acontecido. Disse que estava apenas dando carona a um morador de rua.</w:t>
+        <w:t>Depois, deu uma explicação para o que tinha acontecido. Disse que estava apenas dando carona a um morador de rua.</w:t>
       </w:r>
     </w:p>
     <w:p>
@@ -247,7 +239,7 @@
         <w:rPr>
           <w:color w:val="000000"/>
         </w:rPr>
-        <w:t>Esse é o quinto objeto dessa história. Um telefone dentro de uma clínica de reabilitação. O mesmo tipo de ligação que, quase trinta anos antes, tinha unido os dois. Agora, ia separá-los.</w:t>
+        <w:t>Esse é o quinto objeto dessa história. Um telefone dentro de uma clínica de reabilitação. Quase trinta anos antes, um telefonema tinha unido os dois. Agora, outro telefonema ia separá-los.</w:t>
       </w:r>
     </w:p>
     <w:p>

</xml_diff>